<commit_message>
Archivos y graficas finales
</commit_message>
<xml_diff>
--- a/Informe.docx
+++ b/Informe.docx
@@ -4,558 +4,783 @@
   <w:body>
     <w:p>
       <w:r>
-        <w:t>Cambios</w:t>
+        <w:t>Informe Taller 2</w:t>
+      </w:r>
+      <w:r>
+        <w:br/>
+        <w:t>Luis David Rodríguez Arias</w:t>
+      </w:r>
+      <w:r>
+        <w:br/>
+        <w:t>cód. 14179</w:t>
+      </w:r>
+    </w:p>
+    <w:p/>
+    <w:p>
+      <w:r>
+        <w:t xml:space="preserve">Después de realizar y comprender los ejercicios de manejo de memoria pase a entender como funcionaba la estrategia </w:t>
+      </w:r>
+      <w:proofErr w:type="spellStart"/>
+      <w:r>
+        <w:t>QNodes</w:t>
+      </w:r>
+      <w:proofErr w:type="spellEnd"/>
+      <w:r>
+        <w:t>. Al lograr comprender como funciona la estrategia y a la par de entender fui observando lo que se pedía en los puntos siguientes, y logre reducir tiempos con las soluciones (cambios) que presentare a continuación.</w:t>
+      </w:r>
+    </w:p>
+    <w:p/>
+    <w:p>
+      <w:r>
+        <w:t>Primer punto.</w:t>
       </w:r>
     </w:p>
     <w:p>
-      <w:pPr>
+      <w:r>
+        <w:t xml:space="preserve">Para detener la estrategia apenas encuentra un par candidato con perdida igual a 0, definí primero la clave de la partición candidata, donde la </w:t>
+      </w:r>
+      <w:r>
+        <w:t>clave única para la partición candidata,</w:t>
+      </w:r>
+      <w:r>
+        <w:t xml:space="preserve"> </w:t>
+      </w:r>
+      <w:r>
+        <w:t>es el conjunto de nodos actuales (</w:t>
+      </w:r>
+      <w:proofErr w:type="spellStart"/>
+      <w:r>
+        <w:t>deltas_ciclo</w:t>
+      </w:r>
+      <w:proofErr w:type="spellEnd"/>
+      <w:r>
+        <w:t>).</w:t>
+      </w:r>
+      <w:r>
+        <w:t xml:space="preserve"> Sabemos que </w:t>
+      </w:r>
+      <w:r>
+        <w:t xml:space="preserve">LAST_IDX es el índice del último elemento de la lista </w:t>
+      </w:r>
+      <w:proofErr w:type="spellStart"/>
+      <w:r>
+        <w:t>deltas_ciclo</w:t>
+      </w:r>
+      <w:proofErr w:type="spellEnd"/>
+      <w:r>
+        <w:t xml:space="preserve">, y lo </w:t>
+      </w:r>
+      <w:r>
+        <w:t>usaremos</w:t>
+      </w:r>
+      <w:r>
+        <w:t xml:space="preserve"> para formar la clave. Si el último elemento de </w:t>
+      </w:r>
+      <w:proofErr w:type="spellStart"/>
+      <w:r>
+        <w:t>deltas_ciclo</w:t>
+      </w:r>
+      <w:proofErr w:type="spellEnd"/>
+      <w:r>
+        <w:t xml:space="preserve"> es una lista, tomamos la tupla; de lo contrario, tomamos el conjunto de </w:t>
+      </w:r>
+      <w:proofErr w:type="spellStart"/>
+      <w:r>
+        <w:t>deltas_ciclo</w:t>
+      </w:r>
+      <w:proofErr w:type="spellEnd"/>
+      <w:r>
+        <w:t>.</w:t>
+      </w:r>
+      <w:r>
+        <w:t xml:space="preserve"> Todo esto para identificar de manera única las particiones candidatas </w:t>
+      </w:r>
+    </w:p>
+    <w:p>
+      <w:pPr>
+        <w:jc w:val="center"/>
+      </w:pPr>
+      <w:r>
+        <w:drawing>
+          <wp:inline distT="0" distB="0" distL="0" distR="0" wp14:anchorId="360FCB10" wp14:editId="16EDF3B7">
+            <wp:extent cx="3581900" cy="971686"/>
+            <wp:effectExtent l="0" t="0" r="0" b="0"/>
+            <wp:docPr id="1680680313" name="Imagen 1"/>
+            <wp:cNvGraphicFramePr>
+              <a:graphicFrameLocks xmlns:a="http://schemas.openxmlformats.org/drawingml/2006/main" noChangeAspect="1"/>
+            </wp:cNvGraphicFramePr>
+            <a:graphic xmlns:a="http://schemas.openxmlformats.org/drawingml/2006/main">
+              <a:graphicData uri="http://schemas.openxmlformats.org/drawingml/2006/picture">
+                <pic:pic xmlns:pic="http://schemas.openxmlformats.org/drawingml/2006/picture">
+                  <pic:nvPicPr>
+                    <pic:cNvPr id="1680680313" name=""/>
+                    <pic:cNvPicPr/>
+                  </pic:nvPicPr>
+                  <pic:blipFill>
+                    <a:blip r:embed="rId5"/>
+                    <a:stretch>
+                      <a:fillRect/>
+                    </a:stretch>
+                  </pic:blipFill>
+                  <pic:spPr>
+                    <a:xfrm>
+                      <a:off x="0" y="0"/>
+                      <a:ext cx="3581900" cy="971686"/>
+                    </a:xfrm>
+                    <a:prstGeom prst="rect">
+                      <a:avLst/>
+                    </a:prstGeom>
+                  </pic:spPr>
+                </pic:pic>
+              </a:graphicData>
+            </a:graphic>
+          </wp:inline>
+        </w:drawing>
+      </w:r>
+    </w:p>
+    <w:p>
+      <w:r>
+        <w:t xml:space="preserve">Ahora guardaremos la partición candidata utilizando la clave </w:t>
+      </w:r>
+      <w:proofErr w:type="spellStart"/>
+      <w:r>
+        <w:t>clave_particion</w:t>
+      </w:r>
+      <w:proofErr w:type="spellEnd"/>
+      <w:r>
+        <w:t xml:space="preserve">, con ella guardaremos </w:t>
+      </w:r>
+      <w:proofErr w:type="spellStart"/>
+      <w:r>
+        <w:t>emd_particion_candidata</w:t>
+      </w:r>
+      <w:proofErr w:type="spellEnd"/>
+      <w:r>
+        <w:t xml:space="preserve"> (l</w:t>
+      </w:r>
+      <w:r>
+        <w:t>a pérdida de la partición</w:t>
+      </w:r>
+      <w:r>
+        <w:t xml:space="preserve">) y </w:t>
+      </w:r>
+      <w:proofErr w:type="spellStart"/>
+      <w:r>
+        <w:t>dist_particion_candidata</w:t>
+      </w:r>
+      <w:proofErr w:type="spellEnd"/>
+      <w:r>
+        <w:t xml:space="preserve"> (l</w:t>
+      </w:r>
+      <w:r>
+        <w:t>a distribución de la partición</w:t>
+      </w:r>
+      <w:r>
+        <w:t>).</w:t>
+      </w:r>
+    </w:p>
+    <w:p>
+      <w:pPr>
+        <w:jc w:val="center"/>
+      </w:pPr>
+      <w:r>
+        <w:drawing>
+          <wp:inline distT="0" distB="0" distL="0" distR="0" wp14:anchorId="04331EE5" wp14:editId="6E1E9862">
+            <wp:extent cx="5612130" cy="423545"/>
+            <wp:effectExtent l="0" t="0" r="7620" b="0"/>
+            <wp:docPr id="992013818" name="Imagen 1"/>
+            <wp:cNvGraphicFramePr>
+              <a:graphicFrameLocks xmlns:a="http://schemas.openxmlformats.org/drawingml/2006/main" noChangeAspect="1"/>
+            </wp:cNvGraphicFramePr>
+            <a:graphic xmlns:a="http://schemas.openxmlformats.org/drawingml/2006/main">
+              <a:graphicData uri="http://schemas.openxmlformats.org/drawingml/2006/picture">
+                <pic:pic xmlns:pic="http://schemas.openxmlformats.org/drawingml/2006/picture">
+                  <pic:nvPicPr>
+                    <pic:cNvPr id="992013818" name=""/>
+                    <pic:cNvPicPr/>
+                  </pic:nvPicPr>
+                  <pic:blipFill>
+                    <a:blip r:embed="rId6"/>
+                    <a:stretch>
+                      <a:fillRect/>
+                    </a:stretch>
+                  </pic:blipFill>
+                  <pic:spPr>
+                    <a:xfrm>
+                      <a:off x="0" y="0"/>
+                      <a:ext cx="5612130" cy="423545"/>
+                    </a:xfrm>
+                    <a:prstGeom prst="rect">
+                      <a:avLst/>
+                    </a:prstGeom>
+                  </pic:spPr>
+                </pic:pic>
+              </a:graphicData>
+            </a:graphic>
+          </wp:inline>
+        </w:drawing>
+      </w:r>
+    </w:p>
+    <w:p>
+      <w:r>
+        <w:t xml:space="preserve">Ahora es donde </w:t>
+      </w:r>
+      <w:r>
+        <w:t xml:space="preserve">buscamos si alguna partición tiene su valor de perdida igual a 0 e inmediatamente retornamos esa partición deteniendo </w:t>
+      </w:r>
+      <w:proofErr w:type="spellStart"/>
+      <w:r>
+        <w:t>asi</w:t>
+      </w:r>
+      <w:proofErr w:type="spellEnd"/>
+      <w:r>
+        <w:t xml:space="preserve"> la búsqueda</w:t>
+      </w:r>
+    </w:p>
+    <w:p>
+      <w:pPr>
+        <w:jc w:val="center"/>
+      </w:pPr>
+      <w:r>
+        <w:drawing>
+          <wp:inline distT="0" distB="0" distL="0" distR="0" wp14:anchorId="46375BFB" wp14:editId="65B83808">
+            <wp:extent cx="5612130" cy="552450"/>
+            <wp:effectExtent l="0" t="0" r="7620" b="0"/>
+            <wp:docPr id="1721976447" name="Imagen 1"/>
+            <wp:cNvGraphicFramePr>
+              <a:graphicFrameLocks xmlns:a="http://schemas.openxmlformats.org/drawingml/2006/main" noChangeAspect="1"/>
+            </wp:cNvGraphicFramePr>
+            <a:graphic xmlns:a="http://schemas.openxmlformats.org/drawingml/2006/main">
+              <a:graphicData uri="http://schemas.openxmlformats.org/drawingml/2006/picture">
+                <pic:pic xmlns:pic="http://schemas.openxmlformats.org/drawingml/2006/picture">
+                  <pic:nvPicPr>
+                    <pic:cNvPr id="1721976447" name=""/>
+                    <pic:cNvPicPr/>
+                  </pic:nvPicPr>
+                  <pic:blipFill>
+                    <a:blip r:embed="rId7"/>
+                    <a:stretch>
+                      <a:fillRect/>
+                    </a:stretch>
+                  </pic:blipFill>
+                  <pic:spPr>
+                    <a:xfrm>
+                      <a:off x="0" y="0"/>
+                      <a:ext cx="5612130" cy="552450"/>
+                    </a:xfrm>
+                    <a:prstGeom prst="rect">
+                      <a:avLst/>
+                    </a:prstGeom>
+                  </pic:spPr>
+                </pic:pic>
+              </a:graphicData>
+            </a:graphic>
+          </wp:inline>
+        </w:drawing>
+      </w:r>
+    </w:p>
+    <w:p/>
+    <w:p/>
+    <w:p>
+      <w:r>
+        <w:t>Esto es útil para identificar de manera única las particiones candidatas y guardarlas correctamente en la memoria del sistema.</w:t>
+      </w:r>
+    </w:p>
+    <w:p/>
+    <w:p>
+      <w:r>
+        <w:t>Segundo punto</w:t>
+      </w:r>
+    </w:p>
+    <w:p>
+      <w:pPr>
+        <w:rPr>
+          <w:rFonts w:cstheme="minorHAnsi"/>
+          <w:lang w:val="es-ES"/>
+        </w:rPr>
+      </w:pPr>
+      <w:r>
+        <w:t xml:space="preserve">Para este punto se nos pedía revisar los procesos de iteración ya que había cálculos </w:t>
+      </w:r>
+      <w:r>
+        <w:rPr>
+          <w:rFonts w:cstheme="minorHAnsi"/>
+          <w:lang w:val="es-ES"/>
+        </w:rPr>
+        <w:t xml:space="preserve">que se </w:t>
+      </w:r>
+      <w:r>
+        <w:rPr>
+          <w:rFonts w:cstheme="minorHAnsi"/>
+          <w:lang w:val="es-ES"/>
+        </w:rPr>
+        <w:t>repetían</w:t>
+      </w:r>
+      <w:r>
+        <w:rPr>
+          <w:rFonts w:cstheme="minorHAnsi"/>
+          <w:lang w:val="es-ES"/>
+        </w:rPr>
+        <w:t xml:space="preserve"> una y otra vez</w:t>
+      </w:r>
+      <w:r>
+        <w:rPr>
+          <w:rFonts w:cstheme="minorHAnsi"/>
+          <w:lang w:val="es-ES"/>
+        </w:rPr>
+        <w:t xml:space="preserve">. Acá me centre en los siguientes archivos: </w:t>
+      </w:r>
+      <w:r>
+        <w:rPr>
+          <w:rFonts w:cstheme="minorHAnsi"/>
+          <w:b/>
+          <w:bCs/>
+          <w:lang w:val="es-ES"/>
+        </w:rPr>
+        <w:t xml:space="preserve">manager.py, q_nodes.py, profile.py, slogger.py, base.py, format.py, sia.py, solution.py, </w:t>
+      </w:r>
+      <w:r>
+        <w:rPr>
+          <w:rFonts w:cstheme="minorHAnsi"/>
+          <w:lang w:val="es-ES"/>
+        </w:rPr>
+        <w:t>y</w:t>
+      </w:r>
+      <w:r>
+        <w:rPr>
+          <w:rFonts w:cstheme="minorHAnsi"/>
+          <w:b/>
+          <w:bCs/>
+          <w:lang w:val="es-ES"/>
+        </w:rPr>
+        <w:t xml:space="preserve"> models.py.</w:t>
+      </w:r>
+    </w:p>
+    <w:p>
+      <w:r>
+        <w:rPr>
+          <w:rFonts w:cstheme="minorHAnsi"/>
+          <w:lang w:val="es-ES"/>
+        </w:rPr>
+        <w:t xml:space="preserve">En el archivo </w:t>
+      </w:r>
+      <w:r>
         <w:rPr>
           <w:b/>
           <w:bCs/>
         </w:rPr>
-      </w:pPr>
-      <w:r>
-        <w:rPr>
-          <w:rFonts w:ascii="Segoe UI Emoji" w:hAnsi="Segoe UI Emoji" w:cs="Segoe UI Emoji"/>
-          <w:b/>
-          <w:bCs/>
-        </w:rPr>
-        <w:t>✅</w:t>
+        <w:t>q_nodes.py</w:t>
       </w:r>
       <w:r>
         <w:rPr>
           <w:b/>
           <w:bCs/>
         </w:rPr>
-        <w:t xml:space="preserve"> q_nodes.py</w:t>
+        <w:t xml:space="preserve"> </w:t>
+      </w:r>
+      <w:r>
+        <w:t>identifiqué</w:t>
+      </w:r>
+      <w:r>
+        <w:t xml:space="preserve"> que la función </w:t>
+      </w:r>
+      <w:proofErr w:type="spellStart"/>
+      <w:r>
+        <w:t>funcion_submodular</w:t>
+      </w:r>
+      <w:proofErr w:type="spellEnd"/>
+      <w:r>
+        <w:t>(...) se llama muchas veces para los mismos deltas en diferentes iteraciones</w:t>
+      </w:r>
+      <w:r>
+        <w:t xml:space="preserve">, por lo que una solución que decidí implementar fue crear </w:t>
+      </w:r>
+      <w:r>
+        <w:t>una caché persistente (</w:t>
+      </w:r>
+      <w:proofErr w:type="spellStart"/>
+      <w:proofErr w:type="gramStart"/>
+      <w:r>
+        <w:t>self.memoria</w:t>
+      </w:r>
+      <w:proofErr w:type="gramEnd"/>
+      <w:r>
+        <w:t>_deltas</w:t>
+      </w:r>
+      <w:proofErr w:type="spellEnd"/>
+      <w:r>
+        <w:t>) solo para valores individuales (</w:t>
+      </w:r>
+      <w:proofErr w:type="spellStart"/>
+      <w:r>
+        <w:t>emd_delta</w:t>
+      </w:r>
+      <w:proofErr w:type="spellEnd"/>
+      <w:r>
+        <w:t>) y distribuciones marginales.</w:t>
       </w:r>
     </w:p>
     <w:p>
-      <w:r>
-        <w:t xml:space="preserve">Este archivo es el </w:t>
+      <w:pPr>
+        <w:jc w:val="center"/>
+      </w:pPr>
+      <w:r>
+        <w:drawing>
+          <wp:inline distT="0" distB="0" distL="0" distR="0" wp14:anchorId="5B2F6258" wp14:editId="43DCBA83">
+            <wp:extent cx="5353797" cy="428685"/>
+            <wp:effectExtent l="0" t="0" r="0" b="9525"/>
+            <wp:docPr id="1282306257" name="Imagen 1"/>
+            <wp:cNvGraphicFramePr>
+              <a:graphicFrameLocks xmlns:a="http://schemas.openxmlformats.org/drawingml/2006/main" noChangeAspect="1"/>
+            </wp:cNvGraphicFramePr>
+            <a:graphic xmlns:a="http://schemas.openxmlformats.org/drawingml/2006/main">
+              <a:graphicData uri="http://schemas.openxmlformats.org/drawingml/2006/picture">
+                <pic:pic xmlns:pic="http://schemas.openxmlformats.org/drawingml/2006/picture">
+                  <pic:nvPicPr>
+                    <pic:cNvPr id="1282306257" name=""/>
+                    <pic:cNvPicPr/>
+                  </pic:nvPicPr>
+                  <pic:blipFill>
+                    <a:blip r:embed="rId8"/>
+                    <a:stretch>
+                      <a:fillRect/>
+                    </a:stretch>
+                  </pic:blipFill>
+                  <pic:spPr>
+                    <a:xfrm>
+                      <a:off x="0" y="0"/>
+                      <a:ext cx="5353797" cy="428685"/>
+                    </a:xfrm>
+                    <a:prstGeom prst="rect">
+                      <a:avLst/>
+                    </a:prstGeom>
+                  </pic:spPr>
+                </pic:pic>
+              </a:graphicData>
+            </a:graphic>
+          </wp:inline>
+        </w:drawing>
+      </w:r>
+    </w:p>
+    <w:p>
+      <w:r>
+        <w:t xml:space="preserve">Y además se implemento que se usara esta memoria antes de computar </w:t>
+      </w:r>
+    </w:p>
+    <w:p>
+      <w:pPr>
+        <w:jc w:val="center"/>
+      </w:pPr>
+      <w:r>
+        <w:drawing>
+          <wp:inline distT="0" distB="0" distL="0" distR="0" wp14:anchorId="079D169F" wp14:editId="68508851">
+            <wp:extent cx="5612130" cy="3070860"/>
+            <wp:effectExtent l="0" t="0" r="7620" b="0"/>
+            <wp:docPr id="1915844407" name="Imagen 1"/>
+            <wp:cNvGraphicFramePr>
+              <a:graphicFrameLocks xmlns:a="http://schemas.openxmlformats.org/drawingml/2006/main" noChangeAspect="1"/>
+            </wp:cNvGraphicFramePr>
+            <a:graphic xmlns:a="http://schemas.openxmlformats.org/drawingml/2006/main">
+              <a:graphicData uri="http://schemas.openxmlformats.org/drawingml/2006/picture">
+                <pic:pic xmlns:pic="http://schemas.openxmlformats.org/drawingml/2006/picture">
+                  <pic:nvPicPr>
+                    <pic:cNvPr id="1915844407" name=""/>
+                    <pic:cNvPicPr/>
+                  </pic:nvPicPr>
+                  <pic:blipFill>
+                    <a:blip r:embed="rId9"/>
+                    <a:stretch>
+                      <a:fillRect/>
+                    </a:stretch>
+                  </pic:blipFill>
+                  <pic:spPr>
+                    <a:xfrm>
+                      <a:off x="0" y="0"/>
+                      <a:ext cx="5612130" cy="3070860"/>
+                    </a:xfrm>
+                    <a:prstGeom prst="rect">
+                      <a:avLst/>
+                    </a:prstGeom>
+                  </pic:spPr>
+                </pic:pic>
+              </a:graphicData>
+            </a:graphic>
+          </wp:inline>
+        </w:drawing>
+      </w:r>
+    </w:p>
+    <w:p>
+      <w:r>
+        <w:t xml:space="preserve">En el archivo </w:t>
       </w:r>
       <w:r>
         <w:rPr>
           <w:b/>
           <w:bCs/>
         </w:rPr>
-        <w:t>núcleo del análisis</w:t>
-      </w:r>
-      <w:r>
-        <w:t>.</w:t>
-      </w:r>
-    </w:p>
-    <w:p>
-      <w:pPr>
+        <w:t>sia.py</w:t>
+      </w:r>
+      <w:r>
         <w:rPr>
           <w:b/>
           <w:bCs/>
         </w:rPr>
-      </w:pPr>
-      <w:r>
-        <w:rPr>
-          <w:rFonts w:ascii="Segoe UI Emoji" w:hAnsi="Segoe UI Emoji" w:cs="Segoe UI Emoji"/>
-          <w:b/>
-          <w:bCs/>
-        </w:rPr>
-        <w:t>🔁</w:t>
-      </w:r>
-      <w:r>
-        <w:rPr>
-          <w:b/>
-          <w:bCs/>
-        </w:rPr>
-        <w:t xml:space="preserve"> Redundancia:</w:t>
+        <w:t xml:space="preserve"> </w:t>
+      </w:r>
+      <w:r>
+        <w:t xml:space="preserve">identifique que el método </w:t>
+      </w:r>
+      <w:proofErr w:type="spellStart"/>
+      <w:r>
+        <w:t>sia_preparar_subsistema</w:t>
+      </w:r>
+      <w:proofErr w:type="spellEnd"/>
+      <w:r>
+        <w:t xml:space="preserve">(...) carga el archivo CSV y vuelve a construir el </w:t>
+      </w:r>
+      <w:proofErr w:type="spellStart"/>
+      <w:r>
+        <w:t>System</w:t>
+      </w:r>
+      <w:proofErr w:type="spellEnd"/>
+      <w:r>
+        <w:t xml:space="preserve"> completo </w:t>
+      </w:r>
+      <w:r>
+        <w:t>para cada llamada</w:t>
+      </w:r>
+      <w:r>
+        <w:t xml:space="preserve">, por lo que se creo el </w:t>
+      </w:r>
+      <w:proofErr w:type="spellStart"/>
+      <w:r>
+        <w:t>System</w:t>
+      </w:r>
+      <w:proofErr w:type="spellEnd"/>
+      <w:r>
+        <w:t xml:space="preserve"> completo una sola vez por </w:t>
+      </w:r>
+      <w:proofErr w:type="spellStart"/>
+      <w:r>
+        <w:t>estado_inicial</w:t>
+      </w:r>
+      <w:proofErr w:type="spellEnd"/>
+      <w:r>
+        <w:t xml:space="preserve">. </w:t>
+      </w:r>
+      <w:r>
+        <w:t>Se agreg</w:t>
+      </w:r>
+      <w:r>
+        <w:t>a</w:t>
+      </w:r>
+      <w:r>
+        <w:t xml:space="preserve"> _</w:t>
+      </w:r>
+      <w:proofErr w:type="spellStart"/>
+      <w:r>
+        <w:t>system_cache</w:t>
+      </w:r>
+      <w:proofErr w:type="spellEnd"/>
+      <w:r>
+        <w:t xml:space="preserve"> (</w:t>
+      </w:r>
+      <w:r>
+        <w:t xml:space="preserve">una variable </w:t>
+      </w:r>
+      <w:r>
+        <w:lastRenderedPageBreak/>
+        <w:t xml:space="preserve">para evitar recargar y reconstruir el </w:t>
+      </w:r>
+      <w:proofErr w:type="spellStart"/>
+      <w:r>
+        <w:t>System</w:t>
+      </w:r>
+      <w:proofErr w:type="spellEnd"/>
+      <w:r>
+        <w:t xml:space="preserve"> completo más de una vez por ejecución</w:t>
+      </w:r>
+      <w:r>
+        <w:t xml:space="preserve">) y modifique </w:t>
+      </w:r>
+      <w:proofErr w:type="spellStart"/>
+      <w:r>
+        <w:t>sia_cargar_</w:t>
+      </w:r>
+      <w:proofErr w:type="gramStart"/>
+      <w:r>
+        <w:t>tpm</w:t>
+      </w:r>
+      <w:proofErr w:type="spellEnd"/>
+      <w:r>
+        <w:t>(</w:t>
+      </w:r>
+      <w:proofErr w:type="gramEnd"/>
+      <w:r>
+        <w:t xml:space="preserve">) </w:t>
+      </w:r>
+      <w:r>
+        <w:t>para que ahora</w:t>
+      </w:r>
+      <w:r>
+        <w:t xml:space="preserve"> devuelv</w:t>
+      </w:r>
+      <w:r>
+        <w:t>a</w:t>
+      </w:r>
+      <w:r>
+        <w:t xml:space="preserve"> una versión en caché de </w:t>
+      </w:r>
+      <w:proofErr w:type="spellStart"/>
+      <w:r>
+        <w:t>System</w:t>
+      </w:r>
+      <w:proofErr w:type="spellEnd"/>
+      <w:r>
+        <w:t>.</w:t>
       </w:r>
     </w:p>
     <w:p>
       <w:pPr>
-        <w:numPr>
-          <w:ilvl w:val="0"/>
-          <w:numId w:val="1"/>
-        </w:numPr>
-      </w:pPr>
-      <w:proofErr w:type="spellStart"/>
-      <w:r>
-        <w:rPr>
-          <w:b/>
-          <w:bCs/>
-        </w:rPr>
-        <w:t>funcion_submodular</w:t>
-      </w:r>
-      <w:proofErr w:type="spellEnd"/>
-      <w:r>
-        <w:rPr>
-          <w:b/>
-          <w:bCs/>
-        </w:rPr>
-        <w:t>(...)</w:t>
-      </w:r>
-      <w:r>
-        <w:t xml:space="preserve"> se llama muchas veces para los mismos deltas en diferentes iteraciones.</w:t>
+        <w:jc w:val="center"/>
+      </w:pPr>
+      <w:r>
+        <w:drawing>
+          <wp:inline distT="0" distB="0" distL="0" distR="0" wp14:anchorId="55C58F8F" wp14:editId="172134CD">
+            <wp:extent cx="4820323" cy="333422"/>
+            <wp:effectExtent l="0" t="0" r="0" b="9525"/>
+            <wp:docPr id="1606095031" name="Imagen 1"/>
+            <wp:cNvGraphicFramePr>
+              <a:graphicFrameLocks xmlns:a="http://schemas.openxmlformats.org/drawingml/2006/main" noChangeAspect="1"/>
+            </wp:cNvGraphicFramePr>
+            <a:graphic xmlns:a="http://schemas.openxmlformats.org/drawingml/2006/main">
+              <a:graphicData uri="http://schemas.openxmlformats.org/drawingml/2006/picture">
+                <pic:pic xmlns:pic="http://schemas.openxmlformats.org/drawingml/2006/picture">
+                  <pic:nvPicPr>
+                    <pic:cNvPr id="1606095031" name=""/>
+                    <pic:cNvPicPr/>
+                  </pic:nvPicPr>
+                  <pic:blipFill>
+                    <a:blip r:embed="rId10"/>
+                    <a:stretch>
+                      <a:fillRect/>
+                    </a:stretch>
+                  </pic:blipFill>
+                  <pic:spPr>
+                    <a:xfrm>
+                      <a:off x="0" y="0"/>
+                      <a:ext cx="4820323" cy="333422"/>
+                    </a:xfrm>
+                    <a:prstGeom prst="rect">
+                      <a:avLst/>
+                    </a:prstGeom>
+                  </pic:spPr>
+                </pic:pic>
+              </a:graphicData>
+            </a:graphic>
+          </wp:inline>
+        </w:drawing>
       </w:r>
     </w:p>
     <w:p>
       <w:pPr>
-        <w:numPr>
-          <w:ilvl w:val="1"/>
-          <w:numId w:val="1"/>
-        </w:numPr>
-      </w:pPr>
-      <w:r>
-        <w:t xml:space="preserve">Aunque parte de esta función guarda en </w:t>
-      </w:r>
-      <w:proofErr w:type="spellStart"/>
-      <w:r>
-        <w:t>memoria_omega</w:t>
-      </w:r>
-      <w:proofErr w:type="spellEnd"/>
-      <w:r>
-        <w:t xml:space="preserve">, </w:t>
-      </w:r>
-      <w:r>
-        <w:rPr>
-          <w:b/>
-          <w:bCs/>
-        </w:rPr>
-        <w:t xml:space="preserve">la EMD de </w:t>
-      </w:r>
-      <w:proofErr w:type="gramStart"/>
-      <w:r>
-        <w:rPr>
-          <w:b/>
-          <w:bCs/>
-        </w:rPr>
-        <w:t>muchos delta</w:t>
-      </w:r>
-      <w:proofErr w:type="gramEnd"/>
-      <w:r>
-        <w:rPr>
-          <w:b/>
-          <w:bCs/>
-        </w:rPr>
-        <w:t xml:space="preserve"> se recalcula</w:t>
-      </w:r>
-      <w:r>
-        <w:t xml:space="preserve"> si no se encuentra en memoria.</w:t>
+        <w:jc w:val="center"/>
+      </w:pPr>
+      <w:r>
+        <w:drawing>
+          <wp:inline distT="0" distB="0" distL="0" distR="0" wp14:anchorId="1393F927" wp14:editId="3CF9A616">
+            <wp:extent cx="5612130" cy="1407160"/>
+            <wp:effectExtent l="0" t="0" r="7620" b="2540"/>
+            <wp:docPr id="1833772455" name="Imagen 1"/>
+            <wp:cNvGraphicFramePr>
+              <a:graphicFrameLocks xmlns:a="http://schemas.openxmlformats.org/drawingml/2006/main" noChangeAspect="1"/>
+            </wp:cNvGraphicFramePr>
+            <a:graphic xmlns:a="http://schemas.openxmlformats.org/drawingml/2006/main">
+              <a:graphicData uri="http://schemas.openxmlformats.org/drawingml/2006/picture">
+                <pic:pic xmlns:pic="http://schemas.openxmlformats.org/drawingml/2006/picture">
+                  <pic:nvPicPr>
+                    <pic:cNvPr id="1833772455" name=""/>
+                    <pic:cNvPicPr/>
+                  </pic:nvPicPr>
+                  <pic:blipFill>
+                    <a:blip r:embed="rId11"/>
+                    <a:stretch>
+                      <a:fillRect/>
+                    </a:stretch>
+                  </pic:blipFill>
+                  <pic:spPr>
+                    <a:xfrm>
+                      <a:off x="0" y="0"/>
+                      <a:ext cx="5612130" cy="1407160"/>
+                    </a:xfrm>
+                    <a:prstGeom prst="rect">
+                      <a:avLst/>
+                    </a:prstGeom>
+                  </pic:spPr>
+                </pic:pic>
+              </a:graphicData>
+            </a:graphic>
+          </wp:inline>
+        </w:drawing>
+      </w:r>
+    </w:p>
+    <w:p/>
+    <w:p>
+      <w:r>
+        <w:t>Tercer Punto</w:t>
       </w:r>
     </w:p>
     <w:p>
-      <w:pPr>
-        <w:numPr>
-          <w:ilvl w:val="1"/>
-          <w:numId w:val="1"/>
-        </w:numPr>
-      </w:pPr>
-      <w:r>
-        <w:t xml:space="preserve">El conjunto de </w:t>
-      </w:r>
-      <w:proofErr w:type="spellStart"/>
-      <w:r>
-        <w:t>vertices</w:t>
-      </w:r>
-      <w:proofErr w:type="spellEnd"/>
-      <w:r>
-        <w:t xml:space="preserve"> también se repite parcialmente en cada fase/ciclo del algoritmo.</w:t>
+      <w:r>
+        <w:t xml:space="preserve">Para este punto se realizará la comparación de los tiempos, particiones y valores de perdida por medio de graficas </w:t>
       </w:r>
     </w:p>
     <w:p>
-      <w:pPr>
-        <w:rPr>
-          <w:b/>
-          <w:bCs/>
-        </w:rPr>
-      </w:pPr>
-      <w:r>
-        <w:rPr>
-          <w:rFonts w:ascii="Segoe UI Emoji" w:hAnsi="Segoe UI Emoji" w:cs="Segoe UI Emoji"/>
-          <w:b/>
-          <w:bCs/>
-        </w:rPr>
-        <w:t>💡</w:t>
-      </w:r>
-      <w:r>
-        <w:rPr>
-          <w:b/>
-          <w:bCs/>
-        </w:rPr>
-        <w:t xml:space="preserve"> Optimización sugerida:</w:t>
-      </w:r>
-    </w:p>
-    <w:p>
-      <w:pPr>
-        <w:numPr>
-          <w:ilvl w:val="0"/>
-          <w:numId w:val="2"/>
-        </w:numPr>
-      </w:pPr>
-      <w:r>
-        <w:t>Crear una caché persistente (</w:t>
-      </w:r>
-      <w:proofErr w:type="spellStart"/>
-      <w:proofErr w:type="gramStart"/>
-      <w:r>
-        <w:t>self.memoria</w:t>
-      </w:r>
-      <w:proofErr w:type="gramEnd"/>
-      <w:r>
-        <w:t>_deltas</w:t>
-      </w:r>
-      <w:proofErr w:type="spellEnd"/>
-      <w:r>
-        <w:t>) solo para valores individuales (</w:t>
-      </w:r>
-      <w:proofErr w:type="spellStart"/>
-      <w:r>
-        <w:t>emd_delta</w:t>
-      </w:r>
-      <w:proofErr w:type="spellEnd"/>
-      <w:r>
-        <w:t>) y distribuciones marginales.</w:t>
-      </w:r>
-    </w:p>
-    <w:p>
-      <w:pPr>
-        <w:rPr>
-          <w:b/>
-          <w:bCs/>
-        </w:rPr>
-      </w:pPr>
-      <w:r>
-        <w:rPr>
-          <w:b/>
-          <w:bCs/>
-        </w:rPr>
-        <w:t xml:space="preserve">En </w:t>
-      </w:r>
-      <w:proofErr w:type="spellStart"/>
-      <w:r>
-        <w:rPr>
-          <w:b/>
-          <w:bCs/>
-        </w:rPr>
-        <w:t>QNodes</w:t>
-      </w:r>
-      <w:proofErr w:type="spellEnd"/>
-      <w:r>
-        <w:rPr>
-          <w:b/>
-          <w:bCs/>
-        </w:rPr>
-        <w:t>:</w:t>
-      </w:r>
-    </w:p>
-    <w:p>
-      <w:pPr>
-        <w:numPr>
-          <w:ilvl w:val="0"/>
-          <w:numId w:val="5"/>
-        </w:numPr>
-      </w:pPr>
-      <w:r>
-        <w:rPr>
-          <w:rFonts w:ascii="Segoe UI Emoji" w:hAnsi="Segoe UI Emoji" w:cs="Segoe UI Emoji"/>
-        </w:rPr>
-        <w:t>✅</w:t>
-      </w:r>
-      <w:r>
-        <w:t xml:space="preserve"> Se agregó </w:t>
-      </w:r>
-      <w:proofErr w:type="spellStart"/>
-      <w:proofErr w:type="gramStart"/>
-      <w:r>
-        <w:t>self.memoria</w:t>
-      </w:r>
-      <w:proofErr w:type="gramEnd"/>
-      <w:r>
-        <w:t>_deltas</w:t>
-      </w:r>
-      <w:proofErr w:type="spellEnd"/>
-      <w:r>
-        <w:t xml:space="preserve">: una caché para evitar recalcular </w:t>
-      </w:r>
-      <w:proofErr w:type="spellStart"/>
-      <w:r>
-        <w:t>emd_delta</w:t>
-      </w:r>
-      <w:proofErr w:type="spellEnd"/>
-      <w:r>
-        <w:t xml:space="preserve"> y su distribución marginal.</w:t>
-      </w:r>
-    </w:p>
-    <w:p>
-      <w:pPr>
-        <w:numPr>
-          <w:ilvl w:val="0"/>
-          <w:numId w:val="5"/>
-        </w:numPr>
-      </w:pPr>
-      <w:r>
-        <w:rPr>
-          <w:rFonts w:ascii="Segoe UI Emoji" w:hAnsi="Segoe UI Emoji" w:cs="Segoe UI Emoji"/>
-        </w:rPr>
-        <w:t>✅</w:t>
-      </w:r>
-      <w:r>
-        <w:t xml:space="preserve"> Se modificó </w:t>
-      </w:r>
-      <w:proofErr w:type="spellStart"/>
-      <w:r>
-        <w:t>funcion_submodular</w:t>
-      </w:r>
-      <w:proofErr w:type="spellEnd"/>
-      <w:r>
-        <w:t>(...) para usar esa memoria antes de computar.</w:t>
+      <w:r>
+        <w:t xml:space="preserve">Para 10 nodos </w:t>
       </w:r>
     </w:p>
     <w:p/>
     <w:p/>
+    <w:p>
+      <w:r>
+        <w:t>Para 1</w:t>
+      </w:r>
+      <w:r>
+        <w:t>5A</w:t>
+      </w:r>
+      <w:r>
+        <w:t xml:space="preserve"> nodos </w:t>
+      </w:r>
+    </w:p>
     <w:p/>
     <w:p/>
     <w:p>
-      <w:pPr>
-        <w:rPr>
-          <w:b/>
-          <w:bCs/>
-        </w:rPr>
-      </w:pPr>
-      <w:r>
-        <w:rPr>
-          <w:rFonts w:ascii="Segoe UI Emoji" w:hAnsi="Segoe UI Emoji" w:cs="Segoe UI Emoji"/>
-          <w:b/>
-          <w:bCs/>
-        </w:rPr>
-        <w:t>✅</w:t>
-      </w:r>
-      <w:r>
-        <w:rPr>
-          <w:b/>
-          <w:bCs/>
-        </w:rPr>
-        <w:t xml:space="preserve"> sia.py</w:t>
+      <w:r>
+        <w:t>Para 1</w:t>
+      </w:r>
+      <w:r>
+        <w:t>5B</w:t>
+      </w:r>
+      <w:r>
+        <w:t xml:space="preserve"> nodos </w:t>
       </w:r>
     </w:p>
+    <w:p/>
+    <w:p/>
     <w:p>
-      <w:pPr>
-        <w:rPr>
-          <w:b/>
-          <w:bCs/>
-        </w:rPr>
-      </w:pPr>
-      <w:r>
-        <w:rPr>
-          <w:rFonts w:ascii="Segoe UI Emoji" w:hAnsi="Segoe UI Emoji" w:cs="Segoe UI Emoji"/>
-          <w:b/>
-          <w:bCs/>
-        </w:rPr>
-        <w:t>🔁</w:t>
-      </w:r>
-      <w:r>
-        <w:rPr>
-          <w:b/>
-          <w:bCs/>
-        </w:rPr>
-        <w:t xml:space="preserve"> Redundancia:</w:t>
+      <w:r>
+        <w:t xml:space="preserve">Para </w:t>
+      </w:r>
+      <w:r>
+        <w:t>2</w:t>
+      </w:r>
+      <w:r>
+        <w:t xml:space="preserve">0 nodos </w:t>
       </w:r>
     </w:p>
-    <w:p>
-      <w:pPr>
-        <w:numPr>
-          <w:ilvl w:val="0"/>
-          <w:numId w:val="3"/>
-        </w:numPr>
-      </w:pPr>
-      <w:r>
-        <w:t xml:space="preserve">El método </w:t>
-      </w:r>
-      <w:proofErr w:type="spellStart"/>
-      <w:r>
-        <w:t>sia_preparar_subsistema</w:t>
-      </w:r>
-      <w:proofErr w:type="spellEnd"/>
-      <w:r>
-        <w:t xml:space="preserve">(...) carga el archivo CSV y vuelve a construir el </w:t>
-      </w:r>
-      <w:proofErr w:type="spellStart"/>
-      <w:r>
-        <w:t>System</w:t>
-      </w:r>
-      <w:proofErr w:type="spellEnd"/>
-      <w:r>
-        <w:t xml:space="preserve"> completo </w:t>
-      </w:r>
-      <w:r>
-        <w:rPr>
-          <w:b/>
-          <w:bCs/>
-        </w:rPr>
-        <w:t>para cada llamada</w:t>
-      </w:r>
-      <w:r>
-        <w:t>.</w:t>
-      </w:r>
-    </w:p>
-    <w:p>
-      <w:pPr>
-        <w:rPr>
-          <w:b/>
-          <w:bCs/>
-        </w:rPr>
-      </w:pPr>
-      <w:r>
-        <w:rPr>
-          <w:rFonts w:ascii="Segoe UI Emoji" w:hAnsi="Segoe UI Emoji" w:cs="Segoe UI Emoji"/>
-          <w:b/>
-          <w:bCs/>
-        </w:rPr>
-        <w:t>💡</w:t>
-      </w:r>
-      <w:r>
-        <w:rPr>
-          <w:b/>
-          <w:bCs/>
-        </w:rPr>
-        <w:t xml:space="preserve"> Optimización sugerida:</w:t>
-      </w:r>
-    </w:p>
-    <w:p>
-      <w:pPr>
-        <w:numPr>
-          <w:ilvl w:val="0"/>
-          <w:numId w:val="4"/>
-        </w:numPr>
-      </w:pPr>
-      <w:r>
-        <w:t xml:space="preserve">Construir el </w:t>
-      </w:r>
-      <w:proofErr w:type="spellStart"/>
-      <w:r>
-        <w:t>System</w:t>
-      </w:r>
-      <w:proofErr w:type="spellEnd"/>
-      <w:r>
-        <w:t xml:space="preserve"> completo </w:t>
-      </w:r>
-      <w:r>
-        <w:rPr>
-          <w:b/>
-          <w:bCs/>
-        </w:rPr>
-        <w:t>una sola vez</w:t>
-      </w:r>
-      <w:r>
-        <w:t xml:space="preserve"> por </w:t>
-      </w:r>
-      <w:proofErr w:type="spellStart"/>
-      <w:r>
-        <w:t>estado_inicial</w:t>
-      </w:r>
-      <w:proofErr w:type="spellEnd"/>
-      <w:r>
-        <w:t>.</w:t>
-      </w:r>
-    </w:p>
-    <w:p>
-      <w:pPr>
-        <w:numPr>
-          <w:ilvl w:val="0"/>
-          <w:numId w:val="4"/>
-        </w:numPr>
-      </w:pPr>
-      <w:r>
-        <w:lastRenderedPageBreak/>
-        <w:t>Guardar la versión "completa" y pasar copias del subsistema condicionado/modificado sin recargar el archivo.</w:t>
-      </w:r>
-    </w:p>
-    <w:p>
-      <w:pPr>
-        <w:rPr>
-          <w:b/>
-          <w:bCs/>
-        </w:rPr>
-      </w:pPr>
-      <w:r>
-        <w:rPr>
-          <w:b/>
-          <w:bCs/>
-        </w:rPr>
-        <w:t>En SIA:</w:t>
-      </w:r>
-    </w:p>
-    <w:p>
-      <w:pPr>
-        <w:numPr>
-          <w:ilvl w:val="0"/>
-          <w:numId w:val="6"/>
-        </w:numPr>
-      </w:pPr>
-      <w:r>
-        <w:rPr>
-          <w:rFonts w:ascii="Segoe UI Emoji" w:hAnsi="Segoe UI Emoji" w:cs="Segoe UI Emoji"/>
-        </w:rPr>
-        <w:t>✅</w:t>
-      </w:r>
-      <w:r>
-        <w:t xml:space="preserve"> Se agregó _</w:t>
-      </w:r>
-      <w:proofErr w:type="spellStart"/>
-      <w:r>
-        <w:t>system_cache</w:t>
-      </w:r>
-      <w:proofErr w:type="spellEnd"/>
-      <w:r>
-        <w:t xml:space="preserve">: una variable para evitar recargar y reconstruir el </w:t>
-      </w:r>
-      <w:proofErr w:type="spellStart"/>
-      <w:r>
-        <w:t>System</w:t>
-      </w:r>
-      <w:proofErr w:type="spellEnd"/>
-      <w:r>
-        <w:t xml:space="preserve"> completo más de una vez por ejecución.</w:t>
-      </w:r>
-    </w:p>
-    <w:p>
-      <w:pPr>
-        <w:numPr>
-          <w:ilvl w:val="0"/>
-          <w:numId w:val="6"/>
-        </w:numPr>
-      </w:pPr>
-      <w:r>
-        <w:rPr>
-          <w:rFonts w:ascii="Segoe UI Emoji" w:hAnsi="Segoe UI Emoji" w:cs="Segoe UI Emoji"/>
-        </w:rPr>
-        <w:t>✅</w:t>
-      </w:r>
-      <w:r>
-        <w:t xml:space="preserve"> </w:t>
-      </w:r>
-      <w:proofErr w:type="spellStart"/>
-      <w:r>
-        <w:t>sia_cargar_</w:t>
-      </w:r>
-      <w:proofErr w:type="gramStart"/>
-      <w:r>
-        <w:t>tpm</w:t>
-      </w:r>
-      <w:proofErr w:type="spellEnd"/>
-      <w:r>
-        <w:t>(</w:t>
-      </w:r>
-      <w:proofErr w:type="gramEnd"/>
-      <w:r>
-        <w:t xml:space="preserve">) ahora devuelve una versión en caché de </w:t>
-      </w:r>
-      <w:proofErr w:type="spellStart"/>
-      <w:r>
-        <w:t>System</w:t>
-      </w:r>
-      <w:proofErr w:type="spellEnd"/>
-      <w:r>
-        <w:t>.</w:t>
-      </w:r>
-    </w:p>
+    <w:p/>
+    <w:p/>
     <w:p/>
     <w:sectPr>
       <w:pgSz w:w="12240" w:h="15840"/>
@@ -2055,6 +2280,7 @@
   <w:style w:type="character" w:default="1" w:styleId="Fuentedeprrafopredeter">
     <w:name w:val="Default Paragraph Font"/>
     <w:uiPriority w:val="1"/>
+    <w:semiHidden/>
     <w:unhideWhenUsed/>
   </w:style>
   <w:style w:type="table" w:default="1" w:styleId="Tablanormal">

</xml_diff>